<commit_message>
docs: corregir las cifras de cobertura verificadas
</commit_message>
<xml_diff>
--- a/ep2/docs/INFORME_PRUEBAS_EDUBIO360_EP2.docx
+++ b/ep2/docs/INFORME_PRUEBAS_EDUBIO360_EP2.docx
@@ -1109,7 +1109,7 @@
                 <w:rFonts w:ascii="Calibri" w:hAnsi="Calibri"/>
                 <w:sz w:val="17"/>
               </w:rPr>
-              <w:t>82,31 %</w:t>
+              <w:t>82,27 %</w:t>
             </w:r>
           </w:p>
         </w:tc>
@@ -12551,7 +12551,7 @@
                 <w:rFonts w:ascii="Calibri" w:hAnsi="Calibri"/>
                 <w:sz w:val="17"/>
               </w:rPr>
-              <w:t>82.31 %</w:t>
+              <w:t>82.27 %</w:t>
             </w:r>
           </w:p>
         </w:tc>
@@ -12671,7 +12671,7 @@
     </w:p>
     <w:p>
       <w:r>
-        <w:t>El resultado de 82,31 % en ramas indica que todavía existen caminos alternativos no ejecutados por los casos actuales. Por ello la cifra de cobertura se interpreta junto con las comprobaciones concretas, no como una garantía de ausencia de defectos.</w:t>
+        <w:t>El resultado de 82,27 % en ramas indica que todavía existen caminos alternativos no ejecutados por los casos actuales. Por ello la cifra de cobertura se interpreta junto con las comprobaciones concretas, no como una garantía de ausencia de defectos.</w:t>
       </w:r>
     </w:p>
     <w:p>

</xml_diff>

<commit_message>
docs: actualizar grafico y tabla de cobertura
</commit_message>
<xml_diff>
--- a/ep2/docs/INFORME_PRUEBAS_EDUBIO360_EP2.docx
+++ b/ep2/docs/INFORME_PRUEBAS_EDUBIO360_EP2.docx
@@ -31,7 +31,7 @@
     </w:p>
     <w:p>
       <w:r>
-        <w:t>Fecha de resultados: 26 de octubre de 2026</w:t>
+        <w:t>Fecha de resultados: 27 de octubre de 2026</w:t>
       </w:r>
     </w:p>
     <w:p>
@@ -12502,7 +12502,7 @@
                 <w:rFonts w:ascii="Calibri" w:hAnsi="Calibri"/>
                 <w:sz w:val="17"/>
               </w:rPr>
-              <w:t>456</w:t>
+              <w:t>455</w:t>
             </w:r>
           </w:p>
         </w:tc>
@@ -12526,7 +12526,7 @@
                 <w:rFonts w:ascii="Calibri" w:hAnsi="Calibri"/>
                 <w:sz w:val="17"/>
               </w:rPr>
-              <w:t>554</w:t>
+              <w:t>553</w:t>
             </w:r>
           </w:p>
         </w:tc>

</xml_diff>